<commit_message>
fix: validate responses, improve accessibility and document layout
</commit_message>
<xml_diff>
--- a/docs/FitStreak-需求分析.docx
+++ b/docs/FitStreak-需求分析.docx
@@ -76,9 +76,9 @@
         <w:tblLook w:firstColumn="1" w:firstRow="1" w:lastColumn="0" w:lastRow="0" w:noHBand="0" w:noVBand="1" w:val="04A0"/>
       </w:tblPr>
       <w:tblGrid>
-        <w:gridCol w:w="3137"/>
-        <w:gridCol w:w="3137"/>
-        <w:gridCol w:w="3137"/>
+        <w:gridCol w:w="1191"/>
+        <w:gridCol w:w="1134"/>
+        <w:gridCol w:w="7087"/>
       </w:tblGrid>
       <w:tr>
         <w:trPr>
@@ -1394,9 +1394,9 @@
         <w:tblLook w:firstColumn="1" w:firstRow="1" w:lastColumn="0" w:lastRow="0" w:noHBand="0" w:noVBand="1" w:val="04A0"/>
       </w:tblPr>
       <w:tblGrid>
-        <w:gridCol w:w="3137"/>
-        <w:gridCol w:w="3137"/>
-        <w:gridCol w:w="3137"/>
+        <w:gridCol w:w="1191"/>
+        <w:gridCol w:w="1134"/>
+        <w:gridCol w:w="7087"/>
       </w:tblGrid>
       <w:tr>
         <w:trPr>
@@ -2389,9 +2389,9 @@
         <w:tblLook w:firstColumn="1" w:firstRow="1" w:lastColumn="0" w:lastRow="0" w:noHBand="0" w:noVBand="1" w:val="04A0"/>
       </w:tblPr>
       <w:tblGrid>
-        <w:gridCol w:w="3137"/>
-        <w:gridCol w:w="3137"/>
-        <w:gridCol w:w="3137"/>
+        <w:gridCol w:w="1191"/>
+        <w:gridCol w:w="1134"/>
+        <w:gridCol w:w="7087"/>
       </w:tblGrid>
       <w:tr>
         <w:trPr>
@@ -3932,9 +3932,6 @@
     <w:qFormat/>
     <w:rsid w:val="00FC693F"/>
     <w:pPr>
-      <w:pBdr>
-        <w:bottom w:val="single" w:sz="8" w:space="4" w:color="4F81BD" w:themeColor="accent1"/>
-      </w:pBdr>
       <w:spacing w:after="280" w:line="300" w:lineRule="auto"/>
       <w:contextualSpacing/>
     </w:pPr>
@@ -4420,9 +4417,6 @@
     <w:qFormat/>
     <w:rsid w:val="00FC693F"/>
     <w:pPr>
-      <w:pBdr>
-        <w:bottom w:val="single" w:sz="4" w:space="4" w:color="4F81BD" w:themeColor="accent1"/>
-      </w:pBdr>
       <w:spacing w:before="200" w:after="280"/>
       <w:ind w:left="936" w:right="936"/>
     </w:pPr>

</xml_diff>